<commit_message>
Geschichte 11: Lückentext ohne Ablenker, mit Gemeindestaat, Genos, Phyle, Areopag
Co-Authored-By: Claude Opus 5.5 <noreply@anthropic.com>
Claude-Session: https://claude.ai/code/session_013iN4Tiarea1J9YUJHZ9iqC
</commit_message>
<xml_diff>
--- a/Geschichte_11/Doppelstunde_Solon/Lueckentext_Polisbildung_A5.docx
+++ b/Geschichte_11/Doppelstunde_Solon/Lueckentext_Polisbildung_A5.docx
@@ -92,19 +92,19 @@
                 <w:sz w:val="17"/>
                 <w:szCs w:val="17"/>
               </w:rPr>
-              <w:t xml:space="preserve">Ergänze die Lücken mit Wörtern aus dem Wortspeicher. Zwei Wörter bleiben übrig. Die fett gedruckten Begriffe sind neu.</w:t>
-            </w:r>
-          </w:p>
-          <w:p>
-            <w:pPr>
-              <w:spacing w:after="120" w:line="300"/>
-            </w:pPr>
-            <w:r>
-              <w:rPr>
-                <w:rFonts w:ascii="Calibri" w:cs="Calibri" w:eastAsia="Calibri" w:hAnsi="Calibri"/>
-                <w:color w:val="2B2318"/>
-                <w:sz w:val="20"/>
-                <w:szCs w:val="20"/>
+              <w:t xml:space="preserve">Ergänze die Lücken mit Wörtern aus dem Wortspeicher. Jedes Wort passt genau einmal. Die fett gedruckten Begriffe sind neu.</w:t>
+            </w:r>
+          </w:p>
+          <w:p>
+            <w:pPr>
+              <w:spacing w:after="90" w:line="262"/>
+            </w:pPr>
+            <w:r>
+              <w:rPr>
+                <w:rFonts w:ascii="Calibri" w:cs="Calibri" w:eastAsia="Calibri" w:hAnsi="Calibri"/>
+                <w:color w:val="2B2318"/>
+                <w:sz w:val="18"/>
+                <w:szCs w:val="18"/>
               </w:rPr>
               <w:t xml:space="preserve">Das griechische Festland ist von </w:t>
             </w:r>
@@ -114,8 +114,8 @@
                 <w:b/>
                 <w:bCs/>
                 <w:color w:val="AD4426"/>
-                <w:sz w:val="20"/>
-                <w:szCs w:val="20"/>
+                <w:sz w:val="18"/>
+                <w:szCs w:val="18"/>
               </w:rPr>
               <w:t xml:space="preserve">(1) ________________</w:t>
             </w:r>
@@ -123,8 +123,8 @@
               <w:rPr>
                 <w:rFonts w:ascii="Calibri" w:cs="Calibri" w:eastAsia="Calibri" w:hAnsi="Calibri"/>
                 <w:color w:val="2B2318"/>
-                <w:sz w:val="20"/>
-                <w:szCs w:val="20"/>
+                <w:sz w:val="18"/>
+                <w:szCs w:val="18"/>
               </w:rPr>
               <w:t xml:space="preserve"> durchzogen. Fruchtbares Ackerland gibt es nur in kleinen </w:t>
             </w:r>
@@ -134,8 +134,8 @@
                 <w:b/>
                 <w:bCs/>
                 <w:color w:val="AD4426"/>
-                <w:sz w:val="20"/>
-                <w:szCs w:val="20"/>
+                <w:sz w:val="18"/>
+                <w:szCs w:val="18"/>
               </w:rPr>
               <w:t xml:space="preserve">(2) ________________</w:t>
             </w:r>
@@ -143,8 +143,8 @@
               <w:rPr>
                 <w:rFonts w:ascii="Calibri" w:cs="Calibri" w:eastAsia="Calibri" w:hAnsi="Calibri"/>
                 <w:color w:val="2B2318"/>
-                <w:sz w:val="20"/>
-                <w:szCs w:val="20"/>
+                <w:sz w:val="18"/>
+                <w:szCs w:val="18"/>
               </w:rPr>
               <w:t xml:space="preserve"> an den Küsten und in den Tälern. Weil die Berge die Siedlungen voneinander trennten, entstand kein großes Reich, sondern viele kleine, unabhängige Stadtstaaten: die </w:t>
             </w:r>
@@ -154,8 +154,8 @@
                 <w:b/>
                 <w:bCs/>
                 <w:color w:val="AD4426"/>
-                <w:sz w:val="20"/>
-                <w:szCs w:val="20"/>
+                <w:sz w:val="18"/>
+                <w:szCs w:val="18"/>
               </w:rPr>
               <w:t xml:space="preserve">(3) ________________</w:t>
             </w:r>
@@ -163,19 +163,19 @@
               <w:rPr>
                 <w:rFonts w:ascii="Calibri" w:cs="Calibri" w:eastAsia="Calibri" w:hAnsi="Calibri"/>
                 <w:color w:val="2B2318"/>
-                <w:sz w:val="20"/>
-                <w:szCs w:val="20"/>
-              </w:rPr>
-              <w:t xml:space="preserve">. Zu jeder Polis gehörten die Stadt mit dem Burgberg, der </w:t>
-            </w:r>
-            <w:r>
-              <w:rPr>
-                <w:rFonts w:ascii="Calibri" w:cs="Calibri" w:eastAsia="Calibri" w:hAnsi="Calibri"/>
-                <w:b/>
-                <w:bCs/>
-                <w:color w:val="AD4426"/>
-                <w:sz w:val="20"/>
-                <w:szCs w:val="20"/>
+                <w:sz w:val="18"/>
+                <w:szCs w:val="18"/>
+              </w:rPr>
+              <w:t xml:space="preserve">. Eine Polis war ein </w:t>
+            </w:r>
+            <w:r>
+              <w:rPr>
+                <w:rFonts w:ascii="Calibri" w:cs="Calibri" w:eastAsia="Calibri" w:hAnsi="Calibri"/>
+                <w:b/>
+                <w:bCs/>
+                <w:color w:val="AD4426"/>
+                <w:sz w:val="18"/>
+                <w:szCs w:val="18"/>
               </w:rPr>
               <w:t xml:space="preserve">(4) ________________</w:t>
             </w:r>
@@ -183,8 +183,42 @@
               <w:rPr>
                 <w:rFonts w:ascii="Calibri" w:cs="Calibri" w:eastAsia="Calibri" w:hAnsi="Calibri"/>
                 <w:color w:val="2B2318"/>
-                <w:sz w:val="20"/>
-                <w:szCs w:val="20"/>
+                <w:sz w:val="18"/>
+                <w:szCs w:val="18"/>
+              </w:rPr>
+              <w:t xml:space="preserve">: Der Staat, das waren seine Bürger. Man sprach deshalb von „den Athenern“, nicht von „Athen“.</w:t>
+            </w:r>
+          </w:p>
+          <w:p>
+            <w:pPr>
+              <w:spacing w:after="90" w:line="262"/>
+            </w:pPr>
+            <w:r>
+              <w:rPr>
+                <w:rFonts w:ascii="Calibri" w:cs="Calibri" w:eastAsia="Calibri" w:hAnsi="Calibri"/>
+                <w:color w:val="2B2318"/>
+                <w:sz w:val="18"/>
+                <w:szCs w:val="18"/>
+              </w:rPr>
+              <w:t xml:space="preserve">Zu jeder Polis gehörten die Stadt mit dem Burgberg, der </w:t>
+            </w:r>
+            <w:r>
+              <w:rPr>
+                <w:rFonts w:ascii="Calibri" w:cs="Calibri" w:eastAsia="Calibri" w:hAnsi="Calibri"/>
+                <w:b/>
+                <w:bCs/>
+                <w:color w:val="AD4426"/>
+                <w:sz w:val="18"/>
+                <w:szCs w:val="18"/>
+              </w:rPr>
+              <w:t xml:space="preserve">(5) ________________</w:t>
+            </w:r>
+            <w:r>
+              <w:rPr>
+                <w:rFonts w:ascii="Calibri" w:cs="Calibri" w:eastAsia="Calibri" w:hAnsi="Calibri"/>
+                <w:color w:val="2B2318"/>
+                <w:sz w:val="18"/>
+                <w:szCs w:val="18"/>
               </w:rPr>
               <w:t xml:space="preserve">, und dem Marktplatz, der </w:t>
             </w:r>
@@ -194,17 +228,17 @@
                 <w:b/>
                 <w:bCs/>
                 <w:color w:val="AD4426"/>
-                <w:sz w:val="20"/>
-                <w:szCs w:val="20"/>
-              </w:rPr>
-              <w:t xml:space="preserve">(5) ________________</w:t>
-            </w:r>
-            <w:r>
-              <w:rPr>
-                <w:rFonts w:ascii="Calibri" w:cs="Calibri" w:eastAsia="Calibri" w:hAnsi="Calibri"/>
-                <w:color w:val="2B2318"/>
-                <w:sz w:val="20"/>
-                <w:szCs w:val="20"/>
+                <w:sz w:val="18"/>
+                <w:szCs w:val="18"/>
+              </w:rPr>
+              <w:t xml:space="preserve">(6) ________________</w:t>
+            </w:r>
+            <w:r>
+              <w:rPr>
+                <w:rFonts w:ascii="Calibri" w:cs="Calibri" w:eastAsia="Calibri" w:hAnsi="Calibri"/>
+                <w:color w:val="2B2318"/>
+                <w:sz w:val="18"/>
+                <w:szCs w:val="18"/>
               </w:rPr>
               <w:t xml:space="preserve">, sowie das Umland mit Feldern und Weiden, die </w:t>
             </w:r>
@@ -214,8 +248,8 @@
                 <w:b/>
                 <w:bCs/>
                 <w:color w:val="AD4426"/>
-                <w:sz w:val="20"/>
-                <w:szCs w:val="20"/>
+                <w:sz w:val="18"/>
+                <w:szCs w:val="18"/>
               </w:rPr>
               <w:t xml:space="preserve">Chora</w:t>
             </w:r>
@@ -223,170 +257,230 @@
               <w:rPr>
                 <w:rFonts w:ascii="Calibri" w:cs="Calibri" w:eastAsia="Calibri" w:hAnsi="Calibri"/>
                 <w:color w:val="2B2318"/>
-                <w:sz w:val="20"/>
-                <w:szCs w:val="20"/>
+                <w:sz w:val="18"/>
+                <w:szCs w:val="18"/>
+              </w:rPr>
+              <w:t xml:space="preserve">. Athen entstand durch den Zusammenschluss vieler Dörfer und Gemeinden der Halbinsel Attika. Dieser Vorgang, der um 700 v. Chr. abgeschlossen war, heißt </w:t>
+            </w:r>
+            <w:r>
+              <w:rPr>
+                <w:rFonts w:ascii="Calibri" w:cs="Calibri" w:eastAsia="Calibri" w:hAnsi="Calibri"/>
+                <w:b/>
+                <w:bCs/>
+                <w:color w:val="AD4426"/>
+                <w:sz w:val="18"/>
+                <w:szCs w:val="18"/>
+              </w:rPr>
+              <w:t xml:space="preserve">Synoikismos</w:t>
+            </w:r>
+            <w:r>
+              <w:rPr>
+                <w:rFonts w:ascii="Calibri" w:cs="Calibri" w:eastAsia="Calibri" w:hAnsi="Calibri"/>
+                <w:color w:val="2B2318"/>
+                <w:sz w:val="18"/>
+                <w:szCs w:val="18"/>
+              </w:rPr>
+              <w:t xml:space="preserve"> (griechisch: „Zusammensiedlung“).</w:t>
+            </w:r>
+          </w:p>
+          <w:p>
+            <w:pPr>
+              <w:spacing w:after="90" w:line="262"/>
+            </w:pPr>
+            <w:r>
+              <w:rPr>
+                <w:rFonts w:ascii="Calibri" w:cs="Calibri" w:eastAsia="Calibri" w:hAnsi="Calibri"/>
+                <w:color w:val="2B2318"/>
+                <w:sz w:val="18"/>
+                <w:szCs w:val="18"/>
+              </w:rPr>
+              <w:t xml:space="preserve">Als die Bevölkerung wuchs, wurde das Ackerland immer </w:t>
+            </w:r>
+            <w:r>
+              <w:rPr>
+                <w:rFonts w:ascii="Calibri" w:cs="Calibri" w:eastAsia="Calibri" w:hAnsi="Calibri"/>
+                <w:b/>
+                <w:bCs/>
+                <w:color w:val="AD4426"/>
+                <w:sz w:val="18"/>
+                <w:szCs w:val="18"/>
+              </w:rPr>
+              <w:t xml:space="preserve">(7) ________________</w:t>
+            </w:r>
+            <w:r>
+              <w:rPr>
+                <w:rFonts w:ascii="Calibri" w:cs="Calibri" w:eastAsia="Calibri" w:hAnsi="Calibri"/>
+                <w:color w:val="2B2318"/>
+                <w:sz w:val="18"/>
+                <w:szCs w:val="18"/>
+              </w:rPr>
+              <w:t xml:space="preserve">. Viele Poleis schickten deshalb Bürger aus, die an den Küsten des Mittelmeers und des Schwarzen Meeres neue Siedlungen gründeten. Diesen Vorgang nennt man </w:t>
+            </w:r>
+            <w:r>
+              <w:rPr>
+                <w:rFonts w:ascii="Calibri" w:cs="Calibri" w:eastAsia="Calibri" w:hAnsi="Calibri"/>
+                <w:b/>
+                <w:bCs/>
+                <w:color w:val="AD4426"/>
+                <w:sz w:val="18"/>
+                <w:szCs w:val="18"/>
+              </w:rPr>
+              <w:t xml:space="preserve">(8) ________________</w:t>
+            </w:r>
+            <w:r>
+              <w:rPr>
+                <w:rFonts w:ascii="Calibri" w:cs="Calibri" w:eastAsia="Calibri" w:hAnsi="Calibri"/>
+                <w:color w:val="2B2318"/>
+                <w:sz w:val="18"/>
+                <w:szCs w:val="18"/>
               </w:rPr>
               <w:t xml:space="preserve">.</w:t>
             </w:r>
           </w:p>
           <w:p>
             <w:pPr>
-              <w:spacing w:after="120" w:line="300"/>
-            </w:pPr>
-            <w:r>
-              <w:rPr>
-                <w:rFonts w:ascii="Calibri" w:cs="Calibri" w:eastAsia="Calibri" w:hAnsi="Calibri"/>
-                <w:color w:val="2B2318"/>
-                <w:sz w:val="20"/>
-                <w:szCs w:val="20"/>
-              </w:rPr>
-              <w:t xml:space="preserve">Athen entstand durch den Zusammenschluss vieler Dörfer und Gemeinden der Halbinsel Attika. Dieser Vorgang, der um 700 v. Chr. abgeschlossen war, heißt </w:t>
-            </w:r>
-            <w:r>
-              <w:rPr>
-                <w:rFonts w:ascii="Calibri" w:cs="Calibri" w:eastAsia="Calibri" w:hAnsi="Calibri"/>
-                <w:b/>
-                <w:bCs/>
-                <w:color w:val="AD4426"/>
-                <w:sz w:val="20"/>
-                <w:szCs w:val="20"/>
-              </w:rPr>
-              <w:t xml:space="preserve">Synoikismos</w:t>
-            </w:r>
-            <w:r>
-              <w:rPr>
-                <w:rFonts w:ascii="Calibri" w:cs="Calibri" w:eastAsia="Calibri" w:hAnsi="Calibri"/>
-                <w:color w:val="2B2318"/>
-                <w:sz w:val="20"/>
-                <w:szCs w:val="20"/>
-              </w:rPr>
-              <w:t xml:space="preserve"> (griechisch: „Zusammensiedlung“).</w:t>
-            </w:r>
-          </w:p>
-          <w:p>
-            <w:pPr>
-              <w:spacing w:after="120" w:line="300"/>
-            </w:pPr>
-            <w:r>
-              <w:rPr>
-                <w:rFonts w:ascii="Calibri" w:cs="Calibri" w:eastAsia="Calibri" w:hAnsi="Calibri"/>
-                <w:color w:val="2B2318"/>
-                <w:sz w:val="20"/>
-                <w:szCs w:val="20"/>
-              </w:rPr>
-              <w:t xml:space="preserve">Als die Bevölkerung wuchs, wurde das Ackerland immer </w:t>
-            </w:r>
-            <w:r>
-              <w:rPr>
-                <w:rFonts w:ascii="Calibri" w:cs="Calibri" w:eastAsia="Calibri" w:hAnsi="Calibri"/>
-                <w:b/>
-                <w:bCs/>
-                <w:color w:val="AD4426"/>
-                <w:sz w:val="20"/>
-                <w:szCs w:val="20"/>
-              </w:rPr>
-              <w:t xml:space="preserve">(6) ________________</w:t>
-            </w:r>
-            <w:r>
-              <w:rPr>
-                <w:rFonts w:ascii="Calibri" w:cs="Calibri" w:eastAsia="Calibri" w:hAnsi="Calibri"/>
-                <w:color w:val="2B2318"/>
-                <w:sz w:val="20"/>
-                <w:szCs w:val="20"/>
-              </w:rPr>
-              <w:t xml:space="preserve">. Viele Poleis schickten deshalb Bürger aus, die an den Küsten des Mittelmeers und des Schwarzen Meeres neue Siedlungen gründeten. Diesen Vorgang nennt man </w:t>
-            </w:r>
-            <w:r>
-              <w:rPr>
-                <w:rFonts w:ascii="Calibri" w:cs="Calibri" w:eastAsia="Calibri" w:hAnsi="Calibri"/>
-                <w:b/>
-                <w:bCs/>
-                <w:color w:val="AD4426"/>
-                <w:sz w:val="20"/>
-                <w:szCs w:val="20"/>
-              </w:rPr>
-              <w:t xml:space="preserve">(7) ________________</w:t>
-            </w:r>
-            <w:r>
-              <w:rPr>
-                <w:rFonts w:ascii="Calibri" w:cs="Calibri" w:eastAsia="Calibri" w:hAnsi="Calibri"/>
-                <w:color w:val="2B2318"/>
-                <w:sz w:val="20"/>
-                <w:szCs w:val="20"/>
+              <w:spacing w:after="90" w:line="262"/>
+            </w:pPr>
+            <w:r>
+              <w:rPr>
+                <w:rFonts w:ascii="Calibri" w:cs="Calibri" w:eastAsia="Calibri" w:hAnsi="Calibri"/>
+                <w:color w:val="2B2318"/>
+                <w:sz w:val="18"/>
+                <w:szCs w:val="18"/>
+              </w:rPr>
+              <w:t xml:space="preserve">Das meiste Land gehörte wenigen reichen Familien, dem </w:t>
+            </w:r>
+            <w:r>
+              <w:rPr>
+                <w:rFonts w:ascii="Calibri" w:cs="Calibri" w:eastAsia="Calibri" w:hAnsi="Calibri"/>
+                <w:b/>
+                <w:bCs/>
+                <w:color w:val="AD4426"/>
+                <w:sz w:val="18"/>
+                <w:szCs w:val="18"/>
+              </w:rPr>
+              <w:t xml:space="preserve">(9) ________________</w:t>
+            </w:r>
+            <w:r>
+              <w:rPr>
+                <w:rFonts w:ascii="Calibri" w:cs="Calibri" w:eastAsia="Calibri" w:hAnsi="Calibri"/>
+                <w:color w:val="2B2318"/>
+                <w:sz w:val="18"/>
+                <w:szCs w:val="18"/>
+              </w:rPr>
+              <w:t xml:space="preserve">. Jede dieser Familien gehörte zu einem Geschlechterverband, einem </w:t>
+            </w:r>
+            <w:r>
+              <w:rPr>
+                <w:rFonts w:ascii="Calibri" w:cs="Calibri" w:eastAsia="Calibri" w:hAnsi="Calibri"/>
+                <w:b/>
+                <w:bCs/>
+                <w:color w:val="AD4426"/>
+                <w:sz w:val="18"/>
+                <w:szCs w:val="18"/>
+              </w:rPr>
+              <w:t xml:space="preserve">(10) ________________</w:t>
+            </w:r>
+            <w:r>
+              <w:rPr>
+                <w:rFonts w:ascii="Calibri" w:cs="Calibri" w:eastAsia="Calibri" w:hAnsi="Calibri"/>
+                <w:color w:val="2B2318"/>
+                <w:sz w:val="18"/>
+                <w:szCs w:val="18"/>
+              </w:rPr>
+              <w:t xml:space="preserve">. Alle Athener waren außerdem in vier große Stammesverbände eingeteilt; ein solcher Verband hieß </w:t>
+            </w:r>
+            <w:r>
+              <w:rPr>
+                <w:rFonts w:ascii="Calibri" w:cs="Calibri" w:eastAsia="Calibri" w:hAnsi="Calibri"/>
+                <w:b/>
+                <w:bCs/>
+                <w:color w:val="AD4426"/>
+                <w:sz w:val="18"/>
+                <w:szCs w:val="18"/>
+              </w:rPr>
+              <w:t xml:space="preserve">(11) ________________</w:t>
+            </w:r>
+            <w:r>
+              <w:rPr>
+                <w:rFonts w:ascii="Calibri" w:cs="Calibri" w:eastAsia="Calibri" w:hAnsi="Calibri"/>
+                <w:color w:val="2B2318"/>
+                <w:sz w:val="18"/>
+                <w:szCs w:val="18"/>
+              </w:rPr>
+              <w:t xml:space="preserve">. Die Adligen hatten auch die politische Macht. Diese Herrschaft der „Besten“ nennt man </w:t>
+            </w:r>
+            <w:r>
+              <w:rPr>
+                <w:rFonts w:ascii="Calibri" w:cs="Calibri" w:eastAsia="Calibri" w:hAnsi="Calibri"/>
+                <w:b/>
+                <w:bCs/>
+                <w:color w:val="AD4426"/>
+                <w:sz w:val="18"/>
+                <w:szCs w:val="18"/>
+              </w:rPr>
+              <w:t xml:space="preserve">(12) ________________</w:t>
+            </w:r>
+            <w:r>
+              <w:rPr>
+                <w:rFonts w:ascii="Calibri" w:cs="Calibri" w:eastAsia="Calibri" w:hAnsi="Calibri"/>
+                <w:color w:val="2B2318"/>
+                <w:sz w:val="18"/>
+                <w:szCs w:val="18"/>
+              </w:rPr>
+              <w:t xml:space="preserve">. Aus ihren Reihen kamen die Archonten, und ihr Rat tagte auf dem Hügel des Kriegsgottes Ares. Er hieß deshalb </w:t>
+            </w:r>
+            <w:r>
+              <w:rPr>
+                <w:rFonts w:ascii="Calibri" w:cs="Calibri" w:eastAsia="Calibri" w:hAnsi="Calibri"/>
+                <w:b/>
+                <w:bCs/>
+                <w:color w:val="AD4426"/>
+                <w:sz w:val="18"/>
+                <w:szCs w:val="18"/>
+              </w:rPr>
+              <w:t xml:space="preserve">(13) ________________</w:t>
+            </w:r>
+            <w:r>
+              <w:rPr>
+                <w:rFonts w:ascii="Calibri" w:cs="Calibri" w:eastAsia="Calibri" w:hAnsi="Calibri"/>
+                <w:color w:val="2B2318"/>
+                <w:sz w:val="18"/>
+                <w:szCs w:val="18"/>
               </w:rPr>
               <w:t xml:space="preserve">.</w:t>
             </w:r>
           </w:p>
           <w:p>
             <w:pPr>
-              <w:spacing w:after="120" w:line="300"/>
-            </w:pPr>
-            <w:r>
-              <w:rPr>
-                <w:rFonts w:ascii="Calibri" w:cs="Calibri" w:eastAsia="Calibri" w:hAnsi="Calibri"/>
-                <w:color w:val="2B2318"/>
-                <w:sz w:val="20"/>
-                <w:szCs w:val="20"/>
-              </w:rPr>
-              <w:t xml:space="preserve">Das meiste Land gehörte wenigen reichen Familien, dem </w:t>
-            </w:r>
-            <w:r>
-              <w:rPr>
-                <w:rFonts w:ascii="Calibri" w:cs="Calibri" w:eastAsia="Calibri" w:hAnsi="Calibri"/>
-                <w:b/>
-                <w:bCs/>
-                <w:color w:val="AD4426"/>
-                <w:sz w:val="20"/>
-                <w:szCs w:val="20"/>
-              </w:rPr>
-              <w:t xml:space="preserve">(8) ________________</w:t>
-            </w:r>
-            <w:r>
-              <w:rPr>
-                <w:rFonts w:ascii="Calibri" w:cs="Calibri" w:eastAsia="Calibri" w:hAnsi="Calibri"/>
-                <w:color w:val="2B2318"/>
-                <w:sz w:val="20"/>
-                <w:szCs w:val="20"/>
-              </w:rPr>
-              <w:t xml:space="preserve">. Sie hatten auch die politische Macht. Diese Herrschaft der „Besten“ nennt man </w:t>
-            </w:r>
-            <w:r>
-              <w:rPr>
-                <w:rFonts w:ascii="Calibri" w:cs="Calibri" w:eastAsia="Calibri" w:hAnsi="Calibri"/>
-                <w:b/>
-                <w:bCs/>
-                <w:color w:val="AD4426"/>
-                <w:sz w:val="20"/>
-                <w:szCs w:val="20"/>
-              </w:rPr>
-              <w:t xml:space="preserve">(9) ________________</w:t>
-            </w:r>
-            <w:r>
-              <w:rPr>
-                <w:rFonts w:ascii="Calibri" w:cs="Calibri" w:eastAsia="Calibri" w:hAnsi="Calibri"/>
-                <w:color w:val="2B2318"/>
-                <w:sz w:val="20"/>
-                <w:szCs w:val="20"/>
-              </w:rPr>
-              <w:t xml:space="preserve">. Viele Kleinbauern dagegen konnten von ihrem Land kaum leben. Sie liehen sich Saatgut und Getreide bei den Adligen und gerieten so in </w:t>
-            </w:r>
-            <w:r>
-              <w:rPr>
-                <w:rFonts w:ascii="Calibri" w:cs="Calibri" w:eastAsia="Calibri" w:hAnsi="Calibri"/>
-                <w:b/>
-                <w:bCs/>
-                <w:color w:val="AD4426"/>
-                <w:sz w:val="20"/>
-                <w:szCs w:val="20"/>
-              </w:rPr>
-              <w:t xml:space="preserve">(10) ________________</w:t>
-            </w:r>
-            <w:r>
-              <w:rPr>
-                <w:rFonts w:ascii="Calibri" w:cs="Calibri" w:eastAsia="Calibri" w:hAnsi="Calibri"/>
-                <w:color w:val="2B2318"/>
-                <w:sz w:val="20"/>
-                <w:szCs w:val="20"/>
+              <w:spacing w:after="90" w:line="262"/>
+            </w:pPr>
+            <w:r>
+              <w:rPr>
+                <w:rFonts w:ascii="Calibri" w:cs="Calibri" w:eastAsia="Calibri" w:hAnsi="Calibri"/>
+                <w:color w:val="2B2318"/>
+                <w:sz w:val="18"/>
+                <w:szCs w:val="18"/>
+              </w:rPr>
+              <w:t xml:space="preserve">Viele Kleinbauern dagegen konnten von ihrem Land kaum leben. Sie liehen sich Saatgut und Getreide bei den Adligen und gerieten so in </w:t>
+            </w:r>
+            <w:r>
+              <w:rPr>
+                <w:rFonts w:ascii="Calibri" w:cs="Calibri" w:eastAsia="Calibri" w:hAnsi="Calibri"/>
+                <w:b/>
+                <w:bCs/>
+                <w:color w:val="AD4426"/>
+                <w:sz w:val="18"/>
+                <w:szCs w:val="18"/>
+              </w:rPr>
+              <w:t xml:space="preserve">(14) ________________</w:t>
+            </w:r>
+            <w:r>
+              <w:rPr>
+                <w:rFonts w:ascii="Calibri" w:cs="Calibri" w:eastAsia="Calibri" w:hAnsi="Calibri"/>
+                <w:color w:val="2B2318"/>
+                <w:sz w:val="18"/>
+                <w:szCs w:val="18"/>
               </w:rPr>
               <w:t xml:space="preserve">.</w:t>
             </w:r>
@@ -451,7 +545,7 @@
                       <w:sz w:val="18"/>
                       <w:szCs w:val="18"/>
                     </w:rPr>
-                    <w:t xml:space="preserve">Adel · Agora · Akropolis · Aristokratie · Demokratie · Ebenen · Gebirgen · knapper · Kolonisation · Monarchie · Poleis · Schulden</w:t>
+                    <w:t xml:space="preserve">Adel · Agora · Akropolis · Areopag · Aristokratie · Ebenen · Gebirgen · Gemeindestaat · Genos · knapper · Kolonisation · Phyle · Poleis · Schulden</w:t>
                   </w:r>
                 </w:p>
               </w:tc>
@@ -465,8 +559,8 @@
               <w:rPr>
                 <w:rFonts w:ascii="Calibri" w:cs="Calibri" w:eastAsia="Calibri" w:hAnsi="Calibri"/>
                 <w:color w:val="2B2318"/>
-                <w:sz w:val="20"/>
-                <w:szCs w:val="20"/>
+                <w:sz w:val="18"/>
+                <w:szCs w:val="18"/>
               </w:rPr>
               <w:t xml:space="preserve"/>
             </w:r>
@@ -495,8 +589,8 @@
               <w:rPr>
                 <w:rFonts w:ascii="Calibri" w:cs="Calibri" w:eastAsia="Calibri" w:hAnsi="Calibri"/>
                 <w:color w:val="BBBBBB"/>
-                <w:sz w:val="20"/>
-                <w:szCs w:val="20"/>
+                <w:sz w:val="18"/>
+                <w:szCs w:val="18"/>
               </w:rPr>
               <w:t xml:space="preserve">______________________________________________________________</w:t>
             </w:r>
@@ -509,8 +603,8 @@
               <w:rPr>
                 <w:rFonts w:ascii="Calibri" w:cs="Calibri" w:eastAsia="Calibri" w:hAnsi="Calibri"/>
                 <w:color w:val="BBBBBB"/>
-                <w:sz w:val="20"/>
-                <w:szCs w:val="20"/>
+                <w:sz w:val="18"/>
+                <w:szCs w:val="18"/>
               </w:rPr>
               <w:t xml:space="preserve">______________________________________________________________</w:t>
             </w:r>
@@ -589,19 +683,19 @@
                 <w:sz w:val="17"/>
                 <w:szCs w:val="17"/>
               </w:rPr>
-              <w:t xml:space="preserve">Ergänze die Lücken mit Wörtern aus dem Wortspeicher. Zwei Wörter bleiben übrig. Die fett gedruckten Begriffe sind neu.</w:t>
-            </w:r>
-          </w:p>
-          <w:p>
-            <w:pPr>
-              <w:spacing w:after="120" w:line="300"/>
-            </w:pPr>
-            <w:r>
-              <w:rPr>
-                <w:rFonts w:ascii="Calibri" w:cs="Calibri" w:eastAsia="Calibri" w:hAnsi="Calibri"/>
-                <w:color w:val="2B2318"/>
-                <w:sz w:val="20"/>
-                <w:szCs w:val="20"/>
+              <w:t xml:space="preserve">Ergänze die Lücken mit Wörtern aus dem Wortspeicher. Jedes Wort passt genau einmal. Die fett gedruckten Begriffe sind neu.</w:t>
+            </w:r>
+          </w:p>
+          <w:p>
+            <w:pPr>
+              <w:spacing w:after="90" w:line="262"/>
+            </w:pPr>
+            <w:r>
+              <w:rPr>
+                <w:rFonts w:ascii="Calibri" w:cs="Calibri" w:eastAsia="Calibri" w:hAnsi="Calibri"/>
+                <w:color w:val="2B2318"/>
+                <w:sz w:val="18"/>
+                <w:szCs w:val="18"/>
               </w:rPr>
               <w:t xml:space="preserve">Das griechische Festland ist von </w:t>
             </w:r>
@@ -611,8 +705,8 @@
                 <w:b/>
                 <w:bCs/>
                 <w:color w:val="AD4426"/>
-                <w:sz w:val="20"/>
-                <w:szCs w:val="20"/>
+                <w:sz w:val="18"/>
+                <w:szCs w:val="18"/>
               </w:rPr>
               <w:t xml:space="preserve">(1) ________________</w:t>
             </w:r>
@@ -620,8 +714,8 @@
               <w:rPr>
                 <w:rFonts w:ascii="Calibri" w:cs="Calibri" w:eastAsia="Calibri" w:hAnsi="Calibri"/>
                 <w:color w:val="2B2318"/>
-                <w:sz w:val="20"/>
-                <w:szCs w:val="20"/>
+                <w:sz w:val="18"/>
+                <w:szCs w:val="18"/>
               </w:rPr>
               <w:t xml:space="preserve"> durchzogen. Fruchtbares Ackerland gibt es nur in kleinen </w:t>
             </w:r>
@@ -631,8 +725,8 @@
                 <w:b/>
                 <w:bCs/>
                 <w:color w:val="AD4426"/>
-                <w:sz w:val="20"/>
-                <w:szCs w:val="20"/>
+                <w:sz w:val="18"/>
+                <w:szCs w:val="18"/>
               </w:rPr>
               <w:t xml:space="preserve">(2) ________________</w:t>
             </w:r>
@@ -640,8 +734,8 @@
               <w:rPr>
                 <w:rFonts w:ascii="Calibri" w:cs="Calibri" w:eastAsia="Calibri" w:hAnsi="Calibri"/>
                 <w:color w:val="2B2318"/>
-                <w:sz w:val="20"/>
-                <w:szCs w:val="20"/>
+                <w:sz w:val="18"/>
+                <w:szCs w:val="18"/>
               </w:rPr>
               <w:t xml:space="preserve"> an den Küsten und in den Tälern. Weil die Berge die Siedlungen voneinander trennten, entstand kein großes Reich, sondern viele kleine, unabhängige Stadtstaaten: die </w:t>
             </w:r>
@@ -651,8 +745,8 @@
                 <w:b/>
                 <w:bCs/>
                 <w:color w:val="AD4426"/>
-                <w:sz w:val="20"/>
-                <w:szCs w:val="20"/>
+                <w:sz w:val="18"/>
+                <w:szCs w:val="18"/>
               </w:rPr>
               <w:t xml:space="preserve">(3) ________________</w:t>
             </w:r>
@@ -660,19 +754,19 @@
               <w:rPr>
                 <w:rFonts w:ascii="Calibri" w:cs="Calibri" w:eastAsia="Calibri" w:hAnsi="Calibri"/>
                 <w:color w:val="2B2318"/>
-                <w:sz w:val="20"/>
-                <w:szCs w:val="20"/>
-              </w:rPr>
-              <w:t xml:space="preserve">. Zu jeder Polis gehörten die Stadt mit dem Burgberg, der </w:t>
-            </w:r>
-            <w:r>
-              <w:rPr>
-                <w:rFonts w:ascii="Calibri" w:cs="Calibri" w:eastAsia="Calibri" w:hAnsi="Calibri"/>
-                <w:b/>
-                <w:bCs/>
-                <w:color w:val="AD4426"/>
-                <w:sz w:val="20"/>
-                <w:szCs w:val="20"/>
+                <w:sz w:val="18"/>
+                <w:szCs w:val="18"/>
+              </w:rPr>
+              <w:t xml:space="preserve">. Eine Polis war ein </w:t>
+            </w:r>
+            <w:r>
+              <w:rPr>
+                <w:rFonts w:ascii="Calibri" w:cs="Calibri" w:eastAsia="Calibri" w:hAnsi="Calibri"/>
+                <w:b/>
+                <w:bCs/>
+                <w:color w:val="AD4426"/>
+                <w:sz w:val="18"/>
+                <w:szCs w:val="18"/>
               </w:rPr>
               <w:t xml:space="preserve">(4) ________________</w:t>
             </w:r>
@@ -680,8 +774,42 @@
               <w:rPr>
                 <w:rFonts w:ascii="Calibri" w:cs="Calibri" w:eastAsia="Calibri" w:hAnsi="Calibri"/>
                 <w:color w:val="2B2318"/>
-                <w:sz w:val="20"/>
-                <w:szCs w:val="20"/>
+                <w:sz w:val="18"/>
+                <w:szCs w:val="18"/>
+              </w:rPr>
+              <w:t xml:space="preserve">: Der Staat, das waren seine Bürger. Man sprach deshalb von „den Athenern“, nicht von „Athen“.</w:t>
+            </w:r>
+          </w:p>
+          <w:p>
+            <w:pPr>
+              <w:spacing w:after="90" w:line="262"/>
+            </w:pPr>
+            <w:r>
+              <w:rPr>
+                <w:rFonts w:ascii="Calibri" w:cs="Calibri" w:eastAsia="Calibri" w:hAnsi="Calibri"/>
+                <w:color w:val="2B2318"/>
+                <w:sz w:val="18"/>
+                <w:szCs w:val="18"/>
+              </w:rPr>
+              <w:t xml:space="preserve">Zu jeder Polis gehörten die Stadt mit dem Burgberg, der </w:t>
+            </w:r>
+            <w:r>
+              <w:rPr>
+                <w:rFonts w:ascii="Calibri" w:cs="Calibri" w:eastAsia="Calibri" w:hAnsi="Calibri"/>
+                <w:b/>
+                <w:bCs/>
+                <w:color w:val="AD4426"/>
+                <w:sz w:val="18"/>
+                <w:szCs w:val="18"/>
+              </w:rPr>
+              <w:t xml:space="preserve">(5) ________________</w:t>
+            </w:r>
+            <w:r>
+              <w:rPr>
+                <w:rFonts w:ascii="Calibri" w:cs="Calibri" w:eastAsia="Calibri" w:hAnsi="Calibri"/>
+                <w:color w:val="2B2318"/>
+                <w:sz w:val="18"/>
+                <w:szCs w:val="18"/>
               </w:rPr>
               <w:t xml:space="preserve">, und dem Marktplatz, der </w:t>
             </w:r>
@@ -691,17 +819,17 @@
                 <w:b/>
                 <w:bCs/>
                 <w:color w:val="AD4426"/>
-                <w:sz w:val="20"/>
-                <w:szCs w:val="20"/>
-              </w:rPr>
-              <w:t xml:space="preserve">(5) ________________</w:t>
-            </w:r>
-            <w:r>
-              <w:rPr>
-                <w:rFonts w:ascii="Calibri" w:cs="Calibri" w:eastAsia="Calibri" w:hAnsi="Calibri"/>
-                <w:color w:val="2B2318"/>
-                <w:sz w:val="20"/>
-                <w:szCs w:val="20"/>
+                <w:sz w:val="18"/>
+                <w:szCs w:val="18"/>
+              </w:rPr>
+              <w:t xml:space="preserve">(6) ________________</w:t>
+            </w:r>
+            <w:r>
+              <w:rPr>
+                <w:rFonts w:ascii="Calibri" w:cs="Calibri" w:eastAsia="Calibri" w:hAnsi="Calibri"/>
+                <w:color w:val="2B2318"/>
+                <w:sz w:val="18"/>
+                <w:szCs w:val="18"/>
               </w:rPr>
               <w:t xml:space="preserve">, sowie das Umland mit Feldern und Weiden, die </w:t>
             </w:r>
@@ -711,8 +839,8 @@
                 <w:b/>
                 <w:bCs/>
                 <w:color w:val="AD4426"/>
-                <w:sz w:val="20"/>
-                <w:szCs w:val="20"/>
+                <w:sz w:val="18"/>
+                <w:szCs w:val="18"/>
               </w:rPr>
               <w:t xml:space="preserve">Chora</w:t>
             </w:r>
@@ -720,170 +848,230 @@
               <w:rPr>
                 <w:rFonts w:ascii="Calibri" w:cs="Calibri" w:eastAsia="Calibri" w:hAnsi="Calibri"/>
                 <w:color w:val="2B2318"/>
-                <w:sz w:val="20"/>
-                <w:szCs w:val="20"/>
+                <w:sz w:val="18"/>
+                <w:szCs w:val="18"/>
+              </w:rPr>
+              <w:t xml:space="preserve">. Athen entstand durch den Zusammenschluss vieler Dörfer und Gemeinden der Halbinsel Attika. Dieser Vorgang, der um 700 v. Chr. abgeschlossen war, heißt </w:t>
+            </w:r>
+            <w:r>
+              <w:rPr>
+                <w:rFonts w:ascii="Calibri" w:cs="Calibri" w:eastAsia="Calibri" w:hAnsi="Calibri"/>
+                <w:b/>
+                <w:bCs/>
+                <w:color w:val="AD4426"/>
+                <w:sz w:val="18"/>
+                <w:szCs w:val="18"/>
+              </w:rPr>
+              <w:t xml:space="preserve">Synoikismos</w:t>
+            </w:r>
+            <w:r>
+              <w:rPr>
+                <w:rFonts w:ascii="Calibri" w:cs="Calibri" w:eastAsia="Calibri" w:hAnsi="Calibri"/>
+                <w:color w:val="2B2318"/>
+                <w:sz w:val="18"/>
+                <w:szCs w:val="18"/>
+              </w:rPr>
+              <w:t xml:space="preserve"> (griechisch: „Zusammensiedlung“).</w:t>
+            </w:r>
+          </w:p>
+          <w:p>
+            <w:pPr>
+              <w:spacing w:after="90" w:line="262"/>
+            </w:pPr>
+            <w:r>
+              <w:rPr>
+                <w:rFonts w:ascii="Calibri" w:cs="Calibri" w:eastAsia="Calibri" w:hAnsi="Calibri"/>
+                <w:color w:val="2B2318"/>
+                <w:sz w:val="18"/>
+                <w:szCs w:val="18"/>
+              </w:rPr>
+              <w:t xml:space="preserve">Als die Bevölkerung wuchs, wurde das Ackerland immer </w:t>
+            </w:r>
+            <w:r>
+              <w:rPr>
+                <w:rFonts w:ascii="Calibri" w:cs="Calibri" w:eastAsia="Calibri" w:hAnsi="Calibri"/>
+                <w:b/>
+                <w:bCs/>
+                <w:color w:val="AD4426"/>
+                <w:sz w:val="18"/>
+                <w:szCs w:val="18"/>
+              </w:rPr>
+              <w:t xml:space="preserve">(7) ________________</w:t>
+            </w:r>
+            <w:r>
+              <w:rPr>
+                <w:rFonts w:ascii="Calibri" w:cs="Calibri" w:eastAsia="Calibri" w:hAnsi="Calibri"/>
+                <w:color w:val="2B2318"/>
+                <w:sz w:val="18"/>
+                <w:szCs w:val="18"/>
+              </w:rPr>
+              <w:t xml:space="preserve">. Viele Poleis schickten deshalb Bürger aus, die an den Küsten des Mittelmeers und des Schwarzen Meeres neue Siedlungen gründeten. Diesen Vorgang nennt man </w:t>
+            </w:r>
+            <w:r>
+              <w:rPr>
+                <w:rFonts w:ascii="Calibri" w:cs="Calibri" w:eastAsia="Calibri" w:hAnsi="Calibri"/>
+                <w:b/>
+                <w:bCs/>
+                <w:color w:val="AD4426"/>
+                <w:sz w:val="18"/>
+                <w:szCs w:val="18"/>
+              </w:rPr>
+              <w:t xml:space="preserve">(8) ________________</w:t>
+            </w:r>
+            <w:r>
+              <w:rPr>
+                <w:rFonts w:ascii="Calibri" w:cs="Calibri" w:eastAsia="Calibri" w:hAnsi="Calibri"/>
+                <w:color w:val="2B2318"/>
+                <w:sz w:val="18"/>
+                <w:szCs w:val="18"/>
               </w:rPr>
               <w:t xml:space="preserve">.</w:t>
             </w:r>
           </w:p>
           <w:p>
             <w:pPr>
-              <w:spacing w:after="120" w:line="300"/>
-            </w:pPr>
-            <w:r>
-              <w:rPr>
-                <w:rFonts w:ascii="Calibri" w:cs="Calibri" w:eastAsia="Calibri" w:hAnsi="Calibri"/>
-                <w:color w:val="2B2318"/>
-                <w:sz w:val="20"/>
-                <w:szCs w:val="20"/>
-              </w:rPr>
-              <w:t xml:space="preserve">Athen entstand durch den Zusammenschluss vieler Dörfer und Gemeinden der Halbinsel Attika. Dieser Vorgang, der um 700 v. Chr. abgeschlossen war, heißt </w:t>
-            </w:r>
-            <w:r>
-              <w:rPr>
-                <w:rFonts w:ascii="Calibri" w:cs="Calibri" w:eastAsia="Calibri" w:hAnsi="Calibri"/>
-                <w:b/>
-                <w:bCs/>
-                <w:color w:val="AD4426"/>
-                <w:sz w:val="20"/>
-                <w:szCs w:val="20"/>
-              </w:rPr>
-              <w:t xml:space="preserve">Synoikismos</w:t>
-            </w:r>
-            <w:r>
-              <w:rPr>
-                <w:rFonts w:ascii="Calibri" w:cs="Calibri" w:eastAsia="Calibri" w:hAnsi="Calibri"/>
-                <w:color w:val="2B2318"/>
-                <w:sz w:val="20"/>
-                <w:szCs w:val="20"/>
-              </w:rPr>
-              <w:t xml:space="preserve"> (griechisch: „Zusammensiedlung“).</w:t>
-            </w:r>
-          </w:p>
-          <w:p>
-            <w:pPr>
-              <w:spacing w:after="120" w:line="300"/>
-            </w:pPr>
-            <w:r>
-              <w:rPr>
-                <w:rFonts w:ascii="Calibri" w:cs="Calibri" w:eastAsia="Calibri" w:hAnsi="Calibri"/>
-                <w:color w:val="2B2318"/>
-                <w:sz w:val="20"/>
-                <w:szCs w:val="20"/>
-              </w:rPr>
-              <w:t xml:space="preserve">Als die Bevölkerung wuchs, wurde das Ackerland immer </w:t>
-            </w:r>
-            <w:r>
-              <w:rPr>
-                <w:rFonts w:ascii="Calibri" w:cs="Calibri" w:eastAsia="Calibri" w:hAnsi="Calibri"/>
-                <w:b/>
-                <w:bCs/>
-                <w:color w:val="AD4426"/>
-                <w:sz w:val="20"/>
-                <w:szCs w:val="20"/>
-              </w:rPr>
-              <w:t xml:space="preserve">(6) ________________</w:t>
-            </w:r>
-            <w:r>
-              <w:rPr>
-                <w:rFonts w:ascii="Calibri" w:cs="Calibri" w:eastAsia="Calibri" w:hAnsi="Calibri"/>
-                <w:color w:val="2B2318"/>
-                <w:sz w:val="20"/>
-                <w:szCs w:val="20"/>
-              </w:rPr>
-              <w:t xml:space="preserve">. Viele Poleis schickten deshalb Bürger aus, die an den Küsten des Mittelmeers und des Schwarzen Meeres neue Siedlungen gründeten. Diesen Vorgang nennt man </w:t>
-            </w:r>
-            <w:r>
-              <w:rPr>
-                <w:rFonts w:ascii="Calibri" w:cs="Calibri" w:eastAsia="Calibri" w:hAnsi="Calibri"/>
-                <w:b/>
-                <w:bCs/>
-                <w:color w:val="AD4426"/>
-                <w:sz w:val="20"/>
-                <w:szCs w:val="20"/>
-              </w:rPr>
-              <w:t xml:space="preserve">(7) ________________</w:t>
-            </w:r>
-            <w:r>
-              <w:rPr>
-                <w:rFonts w:ascii="Calibri" w:cs="Calibri" w:eastAsia="Calibri" w:hAnsi="Calibri"/>
-                <w:color w:val="2B2318"/>
-                <w:sz w:val="20"/>
-                <w:szCs w:val="20"/>
+              <w:spacing w:after="90" w:line="262"/>
+            </w:pPr>
+            <w:r>
+              <w:rPr>
+                <w:rFonts w:ascii="Calibri" w:cs="Calibri" w:eastAsia="Calibri" w:hAnsi="Calibri"/>
+                <w:color w:val="2B2318"/>
+                <w:sz w:val="18"/>
+                <w:szCs w:val="18"/>
+              </w:rPr>
+              <w:t xml:space="preserve">Das meiste Land gehörte wenigen reichen Familien, dem </w:t>
+            </w:r>
+            <w:r>
+              <w:rPr>
+                <w:rFonts w:ascii="Calibri" w:cs="Calibri" w:eastAsia="Calibri" w:hAnsi="Calibri"/>
+                <w:b/>
+                <w:bCs/>
+                <w:color w:val="AD4426"/>
+                <w:sz w:val="18"/>
+                <w:szCs w:val="18"/>
+              </w:rPr>
+              <w:t xml:space="preserve">(9) ________________</w:t>
+            </w:r>
+            <w:r>
+              <w:rPr>
+                <w:rFonts w:ascii="Calibri" w:cs="Calibri" w:eastAsia="Calibri" w:hAnsi="Calibri"/>
+                <w:color w:val="2B2318"/>
+                <w:sz w:val="18"/>
+                <w:szCs w:val="18"/>
+              </w:rPr>
+              <w:t xml:space="preserve">. Jede dieser Familien gehörte zu einem Geschlechterverband, einem </w:t>
+            </w:r>
+            <w:r>
+              <w:rPr>
+                <w:rFonts w:ascii="Calibri" w:cs="Calibri" w:eastAsia="Calibri" w:hAnsi="Calibri"/>
+                <w:b/>
+                <w:bCs/>
+                <w:color w:val="AD4426"/>
+                <w:sz w:val="18"/>
+                <w:szCs w:val="18"/>
+              </w:rPr>
+              <w:t xml:space="preserve">(10) ________________</w:t>
+            </w:r>
+            <w:r>
+              <w:rPr>
+                <w:rFonts w:ascii="Calibri" w:cs="Calibri" w:eastAsia="Calibri" w:hAnsi="Calibri"/>
+                <w:color w:val="2B2318"/>
+                <w:sz w:val="18"/>
+                <w:szCs w:val="18"/>
+              </w:rPr>
+              <w:t xml:space="preserve">. Alle Athener waren außerdem in vier große Stammesverbände eingeteilt; ein solcher Verband hieß </w:t>
+            </w:r>
+            <w:r>
+              <w:rPr>
+                <w:rFonts w:ascii="Calibri" w:cs="Calibri" w:eastAsia="Calibri" w:hAnsi="Calibri"/>
+                <w:b/>
+                <w:bCs/>
+                <w:color w:val="AD4426"/>
+                <w:sz w:val="18"/>
+                <w:szCs w:val="18"/>
+              </w:rPr>
+              <w:t xml:space="preserve">(11) ________________</w:t>
+            </w:r>
+            <w:r>
+              <w:rPr>
+                <w:rFonts w:ascii="Calibri" w:cs="Calibri" w:eastAsia="Calibri" w:hAnsi="Calibri"/>
+                <w:color w:val="2B2318"/>
+                <w:sz w:val="18"/>
+                <w:szCs w:val="18"/>
+              </w:rPr>
+              <w:t xml:space="preserve">. Die Adligen hatten auch die politische Macht. Diese Herrschaft der „Besten“ nennt man </w:t>
+            </w:r>
+            <w:r>
+              <w:rPr>
+                <w:rFonts w:ascii="Calibri" w:cs="Calibri" w:eastAsia="Calibri" w:hAnsi="Calibri"/>
+                <w:b/>
+                <w:bCs/>
+                <w:color w:val="AD4426"/>
+                <w:sz w:val="18"/>
+                <w:szCs w:val="18"/>
+              </w:rPr>
+              <w:t xml:space="preserve">(12) ________________</w:t>
+            </w:r>
+            <w:r>
+              <w:rPr>
+                <w:rFonts w:ascii="Calibri" w:cs="Calibri" w:eastAsia="Calibri" w:hAnsi="Calibri"/>
+                <w:color w:val="2B2318"/>
+                <w:sz w:val="18"/>
+                <w:szCs w:val="18"/>
+              </w:rPr>
+              <w:t xml:space="preserve">. Aus ihren Reihen kamen die Archonten, und ihr Rat tagte auf dem Hügel des Kriegsgottes Ares. Er hieß deshalb </w:t>
+            </w:r>
+            <w:r>
+              <w:rPr>
+                <w:rFonts w:ascii="Calibri" w:cs="Calibri" w:eastAsia="Calibri" w:hAnsi="Calibri"/>
+                <w:b/>
+                <w:bCs/>
+                <w:color w:val="AD4426"/>
+                <w:sz w:val="18"/>
+                <w:szCs w:val="18"/>
+              </w:rPr>
+              <w:t xml:space="preserve">(13) ________________</w:t>
+            </w:r>
+            <w:r>
+              <w:rPr>
+                <w:rFonts w:ascii="Calibri" w:cs="Calibri" w:eastAsia="Calibri" w:hAnsi="Calibri"/>
+                <w:color w:val="2B2318"/>
+                <w:sz w:val="18"/>
+                <w:szCs w:val="18"/>
               </w:rPr>
               <w:t xml:space="preserve">.</w:t>
             </w:r>
           </w:p>
           <w:p>
             <w:pPr>
-              <w:spacing w:after="120" w:line="300"/>
-            </w:pPr>
-            <w:r>
-              <w:rPr>
-                <w:rFonts w:ascii="Calibri" w:cs="Calibri" w:eastAsia="Calibri" w:hAnsi="Calibri"/>
-                <w:color w:val="2B2318"/>
-                <w:sz w:val="20"/>
-                <w:szCs w:val="20"/>
-              </w:rPr>
-              <w:t xml:space="preserve">Das meiste Land gehörte wenigen reichen Familien, dem </w:t>
-            </w:r>
-            <w:r>
-              <w:rPr>
-                <w:rFonts w:ascii="Calibri" w:cs="Calibri" w:eastAsia="Calibri" w:hAnsi="Calibri"/>
-                <w:b/>
-                <w:bCs/>
-                <w:color w:val="AD4426"/>
-                <w:sz w:val="20"/>
-                <w:szCs w:val="20"/>
-              </w:rPr>
-              <w:t xml:space="preserve">(8) ________________</w:t>
-            </w:r>
-            <w:r>
-              <w:rPr>
-                <w:rFonts w:ascii="Calibri" w:cs="Calibri" w:eastAsia="Calibri" w:hAnsi="Calibri"/>
-                <w:color w:val="2B2318"/>
-                <w:sz w:val="20"/>
-                <w:szCs w:val="20"/>
-              </w:rPr>
-              <w:t xml:space="preserve">. Sie hatten auch die politische Macht. Diese Herrschaft der „Besten“ nennt man </w:t>
-            </w:r>
-            <w:r>
-              <w:rPr>
-                <w:rFonts w:ascii="Calibri" w:cs="Calibri" w:eastAsia="Calibri" w:hAnsi="Calibri"/>
-                <w:b/>
-                <w:bCs/>
-                <w:color w:val="AD4426"/>
-                <w:sz w:val="20"/>
-                <w:szCs w:val="20"/>
-              </w:rPr>
-              <w:t xml:space="preserve">(9) ________________</w:t>
-            </w:r>
-            <w:r>
-              <w:rPr>
-                <w:rFonts w:ascii="Calibri" w:cs="Calibri" w:eastAsia="Calibri" w:hAnsi="Calibri"/>
-                <w:color w:val="2B2318"/>
-                <w:sz w:val="20"/>
-                <w:szCs w:val="20"/>
-              </w:rPr>
-              <w:t xml:space="preserve">. Viele Kleinbauern dagegen konnten von ihrem Land kaum leben. Sie liehen sich Saatgut und Getreide bei den Adligen und gerieten so in </w:t>
-            </w:r>
-            <w:r>
-              <w:rPr>
-                <w:rFonts w:ascii="Calibri" w:cs="Calibri" w:eastAsia="Calibri" w:hAnsi="Calibri"/>
-                <w:b/>
-                <w:bCs/>
-                <w:color w:val="AD4426"/>
-                <w:sz w:val="20"/>
-                <w:szCs w:val="20"/>
-              </w:rPr>
-              <w:t xml:space="preserve">(10) ________________</w:t>
-            </w:r>
-            <w:r>
-              <w:rPr>
-                <w:rFonts w:ascii="Calibri" w:cs="Calibri" w:eastAsia="Calibri" w:hAnsi="Calibri"/>
-                <w:color w:val="2B2318"/>
-                <w:sz w:val="20"/>
-                <w:szCs w:val="20"/>
+              <w:spacing w:after="90" w:line="262"/>
+            </w:pPr>
+            <w:r>
+              <w:rPr>
+                <w:rFonts w:ascii="Calibri" w:cs="Calibri" w:eastAsia="Calibri" w:hAnsi="Calibri"/>
+                <w:color w:val="2B2318"/>
+                <w:sz w:val="18"/>
+                <w:szCs w:val="18"/>
+              </w:rPr>
+              <w:t xml:space="preserve">Viele Kleinbauern dagegen konnten von ihrem Land kaum leben. Sie liehen sich Saatgut und Getreide bei den Adligen und gerieten so in </w:t>
+            </w:r>
+            <w:r>
+              <w:rPr>
+                <w:rFonts w:ascii="Calibri" w:cs="Calibri" w:eastAsia="Calibri" w:hAnsi="Calibri"/>
+                <w:b/>
+                <w:bCs/>
+                <w:color w:val="AD4426"/>
+                <w:sz w:val="18"/>
+                <w:szCs w:val="18"/>
+              </w:rPr>
+              <w:t xml:space="preserve">(14) ________________</w:t>
+            </w:r>
+            <w:r>
+              <w:rPr>
+                <w:rFonts w:ascii="Calibri" w:cs="Calibri" w:eastAsia="Calibri" w:hAnsi="Calibri"/>
+                <w:color w:val="2B2318"/>
+                <w:sz w:val="18"/>
+                <w:szCs w:val="18"/>
               </w:rPr>
               <w:t xml:space="preserve">.</w:t>
             </w:r>
@@ -948,7 +1136,7 @@
                       <w:sz w:val="18"/>
                       <w:szCs w:val="18"/>
                     </w:rPr>
-                    <w:t xml:space="preserve">Adel · Agora · Akropolis · Aristokratie · Demokratie · Ebenen · Gebirgen · knapper · Kolonisation · Monarchie · Poleis · Schulden</w:t>
+                    <w:t xml:space="preserve">Adel · Agora · Akropolis · Areopag · Aristokratie · Ebenen · Gebirgen · Gemeindestaat · Genos · knapper · Kolonisation · Phyle · Poleis · Schulden</w:t>
                   </w:r>
                 </w:p>
               </w:tc>
@@ -962,8 +1150,8 @@
               <w:rPr>
                 <w:rFonts w:ascii="Calibri" w:cs="Calibri" w:eastAsia="Calibri" w:hAnsi="Calibri"/>
                 <w:color w:val="2B2318"/>
-                <w:sz w:val="20"/>
-                <w:szCs w:val="20"/>
+                <w:sz w:val="18"/>
+                <w:szCs w:val="18"/>
               </w:rPr>
               <w:t xml:space="preserve"/>
             </w:r>
@@ -992,8 +1180,8 @@
               <w:rPr>
                 <w:rFonts w:ascii="Calibri" w:cs="Calibri" w:eastAsia="Calibri" w:hAnsi="Calibri"/>
                 <w:color w:val="BBBBBB"/>
-                <w:sz w:val="20"/>
-                <w:szCs w:val="20"/>
+                <w:sz w:val="18"/>
+                <w:szCs w:val="18"/>
               </w:rPr>
               <w:t xml:space="preserve">______________________________________________________________</w:t>
             </w:r>
@@ -1006,8 +1194,8 @@
               <w:rPr>
                 <w:rFonts w:ascii="Calibri" w:cs="Calibri" w:eastAsia="Calibri" w:hAnsi="Calibri"/>
                 <w:color w:val="BBBBBB"/>
-                <w:sz w:val="20"/>
-                <w:szCs w:val="20"/>
+                <w:sz w:val="18"/>
+                <w:szCs w:val="18"/>
               </w:rPr>
               <w:t xml:space="preserve">______________________________________________________________</w:t>
             </w:r>

</xml_diff>